<commit_message>
Pull Drive-newer notebooks, deck and setup docx (drift reconciliation before 2026-09 refresh)
Co-Authored-By: Claude Fable 5.1 <noreply@anthropic.com>
Claude-Session: https://claude.ai/code/session_013ZyZmXoJVnzkDMWgzrVGff
</commit_message>
<xml_diff>
--- a/0_Setting up environment and first request to API.docx
+++ b/0_Setting up environment and first request to API.docx
@@ -196,7 +196,7 @@
           <w:szCs w:val="24"/>
           <w:rtl w:val="0"/>
         </w:rPr>
-        <w:t xml:space="preserve"> to download the latest version. Ensure you have at least Python 3.7.1 or newer to use the library effectively. You can verify Python installation by running:</w:t>
+        <w:t xml:space="preserve"> to download the latest version. Ensure you have Python 3.10 or newer (the course materials were tested on Python 3.10 to 3.14). You can verify Python installation by running:</w:t>
       </w:r>
     </w:p>
     <w:p>
@@ -890,7 +890,7 @@
         <w:rPr>
           <w:rtl w:val="0"/>
         </w:rPr>
-        <w:t xml:space="preserve">3. Installing the OpenAI Python library</w:t>
+        <w:t xml:space="preserve">3. Installing the course libraries</w:t>
       </w:r>
     </w:p>
     <w:p>
@@ -923,43 +923,43 @@
           <w:szCs w:val="24"/>
           <w:rtl w:val="0"/>
         </w:rPr>
-        <w:t xml:space="preserve">Now, you can install the OpenAI Python library by running:</w:t>
-      </w:r>
-    </w:p>
-    <w:p>
-      <w:pPr>
-        <w:jc w:val="both"/>
-        <w:rPr>
-          <w:rFonts w:ascii="Nunito" w:cs="Nunito" w:eastAsia="Nunito" w:hAnsi="Nunito"/>
-          <w:sz w:val="24"/>
-          <w:szCs w:val="24"/>
-        </w:rPr>
-      </w:pPr>
-      <w:r>
-        <w:rPr>
-          <w:rtl w:val="0"/>
-        </w:rPr>
-      </w:r>
-    </w:p>
-    <w:p>
-      <w:pPr>
-        <w:jc w:val="both"/>
-        <w:rPr>
-          <w:rFonts w:ascii="Nunito" w:cs="Nunito" w:eastAsia="Nunito" w:hAnsi="Nunito"/>
-          <w:b w:val="1"/>
-          <w:sz w:val="24"/>
-          <w:szCs w:val="24"/>
-        </w:rPr>
-      </w:pPr>
-      <w:r>
-        <w:rPr>
-          <w:rFonts w:ascii="Nunito" w:cs="Nunito" w:eastAsia="Nunito" w:hAnsi="Nunito"/>
-          <w:b w:val="1"/>
-          <w:sz w:val="24"/>
-          <w:szCs w:val="24"/>
-          <w:rtl w:val="0"/>
-        </w:rPr>
-        <w:t xml:space="preserve">pip install --upgrade openai</w:t>
+        <w:t xml:space="preserve">Now install every library the course notebooks use. The course materials folder (course_materials on Google Drive) contains a file called requirements.txt that lists them all. Copy that file into your project folder and, with the virtual environment still active, run:</w:t>
+      </w:r>
+    </w:p>
+    <w:p>
+      <w:pPr>
+        <w:jc w:val="both"/>
+        <w:rPr>
+          <w:rFonts w:ascii="Nunito" w:cs="Nunito" w:eastAsia="Nunito" w:hAnsi="Nunito"/>
+          <w:sz w:val="24"/>
+          <w:szCs w:val="24"/>
+        </w:rPr>
+      </w:pPr>
+      <w:r>
+        <w:rPr>
+          <w:rtl w:val="0"/>
+        </w:rPr>
+      </w:r>
+    </w:p>
+    <w:p>
+      <w:pPr>
+        <w:jc w:val="both"/>
+        <w:rPr>
+          <w:rFonts w:ascii="Nunito" w:cs="Nunito" w:eastAsia="Nunito" w:hAnsi="Nunito"/>
+          <w:b w:val="1"/>
+          <w:sz w:val="24"/>
+          <w:szCs w:val="24"/>
+        </w:rPr>
+      </w:pPr>
+      <w:r>
+        <w:rPr>
+          <w:rFonts w:ascii="Nunito" w:cs="Nunito" w:eastAsia="Nunito" w:hAnsi="Nunito"/>
+          <w:b w:val="1"/>
+          <w:sz w:val="24"/>
+          <w:szCs w:val="24"/>
+          <w:rtl w:val="0"/>
+        </w:rPr>
+        <w:t xml:space="preserve">pip install -r requirements.txt</w:t>
       </w:r>
     </w:p>
     <w:p>
@@ -1031,7 +1031,7 @@
           <w:szCs w:val="24"/>
           <w:rtl w:val="0"/>
         </w:rPr>
-        <w:t xml:space="preserve">will display all the Python libraries installed in your current environment. You should see the "openai" library listed there.</w:t>
+        <w:t xml:space="preserve">will display all the Python libraries installed in your current environment. You should see the "openai" library listed there, together with "jupyter" and the other course libraries.</w:t>
       </w:r>
     </w:p>
     <w:p>
@@ -2173,13 +2173,7 @@
         <w:rPr>
           <w:rtl w:val="0"/>
         </w:rPr>
-        <w:t xml:space="preserve">5. </w:t>
-      </w:r>
-      <w:r>
-        <w:rPr>
-          <w:rtl w:val="0"/>
-        </w:rPr>
-        <w:t xml:space="preserve">What is API?</w:t>
+        <w:t xml:space="preserve">5. What is API?</w:t>
       </w:r>
     </w:p>
     <w:p>
@@ -2458,13 +2452,7 @@
         <w:rPr>
           <w:rtl w:val="0"/>
         </w:rPr>
-        <w:t xml:space="preserve">6</w:t>
-      </w:r>
-      <w:r>
-        <w:rPr>
-          <w:rtl w:val="0"/>
-        </w:rPr>
-        <w:t xml:space="preserve">. Sending first API request</w:t>
+        <w:t xml:space="preserve">6. Sending first API request</w:t>
       </w:r>
     </w:p>
     <w:p>
@@ -2495,11 +2483,6 @@
         </w:rPr>
         <w:t xml:space="preserve">After configuring Python and setting up your API key, the next step is to send a request to the OpenAI API using the Python library. Follow these instructions:</w:t>
       </w:r>
-      <w:r>
-        <w:rPr>
-          <w:rtl w:val="0"/>
-        </w:rPr>
-      </w:r>
     </w:p>
     <w:p>
       <w:pPr>
@@ -2541,26 +2524,7 @@
           <w:szCs w:val="24"/>
           <w:rtl w:val="0"/>
         </w:rPr>
-        <w:t xml:space="preserve">For example, you can use a Jupyter notebook. First, install Jupyter by executing command </w:t>
-      </w:r>
-      <w:r>
-        <w:rPr>
-          <w:rFonts w:ascii="Nunito" w:cs="Nunito" w:eastAsia="Nunito" w:hAnsi="Nunito"/>
-          <w:b w:val="1"/>
-          <w:sz w:val="24"/>
-          <w:szCs w:val="24"/>
-          <w:rtl w:val="0"/>
-        </w:rPr>
-        <w:t xml:space="preserve">jupyter</w:t>
-      </w:r>
-      <w:r>
-        <w:rPr>
-          <w:rFonts w:ascii="Nunito" w:cs="Nunito" w:eastAsia="Nunito" w:hAnsi="Nunito"/>
-          <w:sz w:val="24"/>
-          <w:szCs w:val="24"/>
-          <w:rtl w:val="0"/>
-        </w:rPr>
-        <w:t xml:space="preserve"> in the same terminal session where you activated the virtual environment. Once the installation is complete, type </w:t>
+        <w:t xml:space="preserve">For example, you can use a Jupyter notebook. Jupyter was installed in step 3 together with the other course libraries. In the same terminal session where you activated the virtual environment, type </w:t>
       </w:r>
       <w:r>
         <w:rPr>
@@ -2941,7 +2905,7 @@
           <w:szCs w:val="24"/>
           <w:rtl w:val="0"/>
         </w:rPr>
-        <w:t xml:space="preserve">response = client.chat.completions.create(</w:t>
+        <w:t xml:space="preserve">response = client.responses.create(</w:t>
       </w:r>
     </w:p>
     <w:p>
@@ -2961,7 +2925,7 @@
           <w:szCs w:val="24"/>
           <w:rtl w:val="0"/>
         </w:rPr>
-        <w:t xml:space="preserve">    model="gpt-3.5-turbo",</w:t>
+        <w:t xml:space="preserve">    model="gpt-5-nano",</w:t>
       </w:r>
     </w:p>
     <w:p>
@@ -2981,7 +2945,7 @@
           <w:szCs w:val="24"/>
           <w:rtl w:val="0"/>
         </w:rPr>
-        <w:t xml:space="preserve">    messages=[</w:t>
+        <w:t xml:space="preserve">    input=[</w:t>
       </w:r>
     </w:p>
     <w:p>
@@ -3001,7 +2965,7 @@
           <w:szCs w:val="24"/>
           <w:rtl w:val="0"/>
         </w:rPr>
-        <w:t xml:space="preserve">        {"role": "system", "content": "You are a creative assistant who writes engaging and educational poems."},</w:t>
+        <w:t xml:space="preserve">        {"role": "developer", "content": "You are a creative assistant who writes engaging and educational poems."},</w:t>
       </w:r>
     </w:p>
     <w:p>
@@ -3150,7 +3114,7 @@
           <w:szCs w:val="24"/>
           <w:rtl w:val="0"/>
         </w:rPr>
-        <w:t xml:space="preserve">response.choices[0].message.content.replace('\n', ' ')</w:t>
+        <w:t xml:space="preserve">print(response.output_text)</w:t>
       </w:r>
     </w:p>
     <w:p>

</xml_diff>